<commit_message>
feat: package macOS trial and record native delivery checks
</commit_message>
<xml_diff>
--- a/docs/FloatLeaf-项目计划书.docx
+++ b/docs/FloatLeaf-项目计划书.docx
@@ -25,7 +25,7 @@
     </w:p>
     <w:p>
       <w:r>
-        <w:t>项目采用 Tauri 2、Vue 3、TypeScript 和 Rust，共用一个代码仓库，分别构建平台安装包。首版离线使用，通过安装包分发。开发首先验证两端的透明窗口、全局按键与焦点行为，再完善小说管理和排版。</w:t>
+        <w:t>项目采用 Tauri 2、Vue 3、TypeScript、Rust 和嵌入式 SQLite，共用一个代码仓库，分别构建平台安装包。首版离线使用。当前已实现原生悬浮控制、TXT 阅读闭环、布局与快捷键设置，macOS 程序路径已验证；真实键鼠、多屏和 Windows 验收仍需独立补齐。交付与性能的最新证据以 HANDOFF.md 和验收记录为准。</w:t>
       </w:r>
     </w:p>
     <w:p>
@@ -2306,7 +2306,7 @@
                 <w:b w:val="0"/>
                 <w:sz w:val="19"/>
               </w:rPr>
-              <w:t>Pinia</w:t>
+              <w:t>Vue 组合函数</w:t>
             </w:r>
           </w:p>
         </w:tc>
@@ -2462,7 +2462,7 @@
                 <w:b w:val="0"/>
                 <w:sz w:val="19"/>
               </w:rPr>
-              <w:t>JSON 与本地文本文件</w:t>
+              <w:t>嵌入式 SQLite</w:t>
             </w:r>
           </w:p>
         </w:tc>
@@ -2627,12 +2627,12 @@
     </w:p>
     <w:p>
       <w:r>
-        <w:t>进度使用书籍内容标识、章节和文本位置，不能只保存页码。统一定义文本位置的计量单位，避免 JavaScript UTF-16 索引与 Rust UTF-8 字节偏移混用。变更字体或尺寸后重新分页，但保持当前阅读锚点。</w:t>
+        <w:t>进度使用正文 SHA-256 标识与 UTF-16 码元锚点，不保存屏幕页码。分页按字素簇边界切分，覆盖 emoji 与组合字符。变更字体或尺寸后重新分页，保持当前阅读锚点。</w:t>
       </w:r>
     </w:p>
     <w:p>
       <w:r>
-        <w:t>导入小说时保存到应用数据目录；配置和进度采用带版本号的结构，以临时文件加原子替换方式写入。进度节流保存，并在正常退出时刷新。导入和编码转换放到后台任务，避免阻塞窗口事件处理。</w:t>
+        <w:t>正文、书架、每书进度和设置统一写入 floatleaf.sqlite3，使用 rusqlite bundled 和直接 SQL，无数据库服务或 ORM。导入使用事务；进度与窗口位置约一秒合并落盘，切书和正常退出立即刷新。退出后备份单个数据库文件即可。导入与编码转换放到后台任务，避免阻塞窗口事件处理。</w:t>
       </w:r>
     </w:p>
     <w:p>
@@ -3107,7 +3107,7 @@
     </w:p>
     <w:p>
       <w:r>
-        <w:t>P0 必须在 Windows 和 macOS 上分别记录结果。单端编译通过不能代表跨平台体验验收通过。若按键释放或窗口焦点不达标，先完成适配验证再扩展书架功能。</w:t>
+        <w:t>P0 必须在 Windows 和 macOS 上分别记录结果。单端编译通过不能代表跨平台体验通过。设备或系统权限待补时，继续完成不受影响的功能和交付工作，同时明确保留待验收项，不将整个目标标记完成。</w:t>
       </w:r>
     </w:p>
     <w:p>
@@ -3219,7 +3219,7 @@
     </w:p>
     <w:p>
       <w:r>
-        <w:t>仓库保留 README、AGENTS.md、产品计划、架构说明、任务清单、环境指南和 HANDOFF 交接记录。任务使用明确编号、依赖与验收条件，完成项须附验证证据。初始化只交付基础骨架，核心阅读能力由后续任务实现。</w:t>
+        <w:t>仓库保留 README、AGENTS.md、产品计划、架构、任务清单、环境指南与 HANDOFF。已实现、已编译、已实测和待验证分别记录，阶段提交保留锁文件并排除真实小说、用户数据和编译缓存。</w:t>
       </w:r>
     </w:p>
     <w:p>

</xml_diff>